<commit_message>
final audit fixes: add A. Context heading, redraw Fig. 1 as SVG, fix Fig. 1 ref in response letter, strip orphaned media; archive revision11 + audit report
</commit_message>
<xml_diff>
--- a/Docs/Upload_package/cover_letter_updated.docx
+++ b/Docs/Upload_package/cover_letter_updated.docx
@@ -23,6 +23,11 @@
       </w:r>
     </w:p>
     <w:p>
+      <w:r>
+        <w:t>with Orpon Chanda</w:t>
+      </w:r>
+    </w:p>
+    <w:p>
       <w:pPr>
         <w:spacing w:after="40"/>
         <w:jc w:val="left"/>
@@ -76,7 +81,7 @@
           <w:sz w:val="22"/>
           <w:szCs w:val="22"/>
         </w:rPr>
-        <w:t xml:space="preserve">11 March 2026</w:t>
+        <w:t>14 August 2026</w:t>
       </w:r>
     </w:p>
     <w:p>
@@ -95,7 +100,7 @@
           <w:sz w:val="22"/>
           <w:szCs w:val="22"/>
         </w:rPr>
-        <w:t xml:space="preserve">The Editorial Board</w:t>
+        <w:t>The Editor-in-Chief</w:t>
       </w:r>
     </w:p>
     <w:p>
@@ -114,7 +119,7 @@
           <w:sz w:val="22"/>
           <w:szCs w:val="22"/>
         </w:rPr>
-        <w:t xml:space="preserve">MDPI Energies</w:t>
+        <w:t>Editorial Board, International Journal of Power Electronics and Drive Systems (IJPEDS)</w:t>
       </w:r>
     </w:p>
     <w:p>
@@ -133,7 +138,7 @@
           <w:sz w:val="22"/>
           <w:szCs w:val="22"/>
         </w:rPr>
-        <w:t xml:space="preserve">MDPI, St. Alban-Anlage 66, Basel, Switzerland 4052</w:t>
+        <w:t>Institute of Advanced Engineering and Science (IAES), Yogyakarta, Indonesia</w:t>
       </w:r>
     </w:p>
     <w:p>
@@ -171,7 +176,7 @@
           <w:sz w:val="22"/>
           <w:szCs w:val="22"/>
         </w:rPr>
-        <w:t xml:space="preserve">We write to submit for your consideration an original research article entitled:</w:t>
+        <w:t>We write to submit for your consideration the revised version of our original research article entitled:</w:t>
       </w:r>
     </w:p>
     <w:p>
@@ -209,7 +214,7 @@
           <w:sz w:val="22"/>
           <w:szCs w:val="22"/>
         </w:rPr>
-        <w:t xml:space="preserve">for publication in Energies, Section: Photovoltaic Systems and Power Electronics.</w:t>
+        <w:t>for publication in the International Journal of Power Electronics and Drive Systems (IJPEDS), Manuscript ID: 25195.</w:t>
       </w:r>
     </w:p>
     <w:p>
@@ -304,7 +309,7 @@
           <w:sz w:val="22"/>
           <w:szCs w:val="22"/>
         </w:rPr>
-        <w:t xml:space="preserve">This paper presents Helios-Artemis, a dual-MCU predictive MPPT controller for cloud-independent, cost-constrained deployment in Sylhet. The architecture decouples intelligence (ESP32-S3 “Helios” — dual LSTM models, TF.js on-device retraining, zero cloud dependency) from real-time control (STM32F103 “Artemis” — 50 kHz variable-step P&amp;O, CC/CV charging) via 100 ms UART. Four primary contributions are made: (1) the dual-MCU architecture itself; (2) a calibrated Sylhet-specific Markov-chain + Ornstein-Uhlenbeck irradiance simulation model incorporating aerosol attenuation, panel soiling, and ADC sensor noise; (3) a 30-day Monte Carlo validation of MPPT efficiency; and (4) a parametric sensitivity analysis of the prediction trust weight α demonstrating parameter-over-fitting robustness. The system trains autonomously on-device within 24 hours of first deployment, requiring no connectivity at any stage.</w:t>
+        <w:t>This paper presents Helios-Artemis, a dual-MCU predictive MPPT controller for cloud-independent, cost-constrained deployment in Sylhet. The architecture decouples intelligence (ESP32-S3 “Helios” — dual LSTM models, TF.js on-device retraining, zero cloud dependency) from real-time control (STM32F103 “Artemis” — 50 kHz variable-step P&amp;O, CC/CV charging) via 100 ms UART. Four primary contributions are made: (1) the dual-MCU architecture itself; (2) a calibrated Sylhet-specific Markov-chain + Ornstein-Uhlenbeck irradiance simulation model incorporating aerosol attenuation, panel soiling, and ADC sensor noise; (3) a 30-day Monte Carlo validation of MPPT efficiency; and (4) a parametric sensitivity analysis of the prediction trust weight α demonstrating parameter-over-fitting robustness. The system trains autonomously on-device within 24 hours of first deployment, requiring no connectivity at any stage. In this revision, the hardware implementation of the field irradiance logger — schematic and PCB layout (Section VII, Figs. 12–13) — is documented, and its 42-hour Sylhet field campaign (July 2026) validates the irradiance model’s short-timescale variability regime.</w:t>
       </w:r>
     </w:p>
     <w:p>
@@ -360,7 +365,7 @@
           <w:sz w:val="22"/>
           <w:szCs w:val="22"/>
         </w:rPr>
-        <w:t xml:space="preserve">MPPT tracking efficiency: 94.0 ± 0.6% mean (30-day Monte Carlo, 95% CI: 92.9–94.9%), versus 70.7% plain P&amp;O — a +23.3 pp improvement at peak monsoon conditions.</w:t>
+        <w:t>MPPT tracking efficiency: η = 94.0 ± 0.6% mean (30 July-day Monte Carlo, ≈93–96% range), versus 70.7% plain P&amp;O — a +23.3 pp improvement at peak monsoon conditions.</w:t>
       </w:r>
     </w:p>
     <w:p>
@@ -378,7 +383,7 @@
           <w:sz w:val="22"/>
           <w:szCs w:val="22"/>
         </w:rPr>
-        <w:t xml:space="preserve">LSTM predictor: R² = 0.917, MAE = 50.7 W/m² on an independent Year-2 test set (365 days, distinct random seed from training data).</w:t>
+        <w:t>LSTM predictor: R² = 0.835, MAE = 54.7 W/m² on an independent Year-2 test set (365 days, distinct random seed from training data); 32-unit network (4,385 parameters, 17 kB quantised).</w:t>
       </w:r>
     </w:p>
     <w:p>
@@ -414,7 +419,7 @@
           <w:sz w:val="22"/>
           <w:szCs w:val="22"/>
         </w:rPr>
-        <w:t>System cost: ~1,500 BDT controller (≈ USD…14) — 89% below IDCOL-compatible commercial alternatives (13,500 BDT). Projected payback period ≈5.2 years at rural avoided cost of 60 BDT/kWh based on annual mean efficiency gain (91.3% vs. 85.8%, Monte Carlo N=30 across all scenarios).</w:t>
+        <w:t>System cost: ~1,750 BDT (≈USD 16) — 87% below IDCOL-compatible commercial alternatives (13,500 BDT). Projected payback period ≈5.2 years at rural avoided cost of 60 BDT/kWh based on annual mean efficiency gain (91.3% vs. 85.8%, Monte Carlo N=30 across all scenarios).</w:t>
       </w:r>
     </w:p>
     <w:p>
@@ -452,7 +457,7 @@
           <w:sz w:val="24"/>
           <w:szCs w:val="24"/>
         </w:rPr>
-        <w:t xml:space="preserve">Fit for Energies</w:t>
+        <w:t>Fit for IJPEDS</w:t>
       </w:r>
     </w:p>
     <w:p>
@@ -471,7 +476,26 @@
           <w:sz w:val="22"/>
           <w:szCs w:val="22"/>
         </w:rPr>
-        <w:t xml:space="preserve">This work addresses Energies scope in photovoltaic systems, power electronics, and energy access in developing regions. The high-variability tropical monsoon context (Cloud Variability Index = 0.85, July) and zero-cloud-dependency constraint offer a novel deployment perspective complementing existing LSTM-MPPT literature concentrated on arid/temperate climates. Results are benchmarked against Hossain et al. field-measured IDCOL SHS baselines and compared with Incremental Conductance and Variable-Step P&amp;O algorithms across four scenario categories. The simulation-only nature of current results is explicitly acknowledged; hardware prototype fabrication in Sylhet (target Q3 2026) constitutes the immediate next phase.</w:t>
+        <w:t>This work addresses the IJPEDS scope in photovoltaic power electronics and renewable energy systems for developing regions. The high-variability tropical monsoon context (Cloud Variability Index = 0.85, July) and zero-cloud-dependency constraint offer a novel deployment perspective complementing existing LSTM-MPPT literature concentrated on arid/temperate climates. Results are benchmarked against Hossain et al. field-measured IDCOL SHS baselines and compared with Incremental Conductance and Variable-Step P&amp;O algorithms across four scenario categories. The simulation-based results are now complemented by a field data collection campaign (42 h, Sylhet, July 2026) whose logged irradiance validates the underlying model; full hardware-in-the-loop validation of the controller constitutes the immediate next phase.</w:t>
+      </w:r>
+    </w:p>
+    <w:p>
+      <w:pPr>
+        <w:spacing w:after="160"/>
+        <w:jc w:val="left"/>
+      </w:pPr>
+      <w:r>
+        <w:rPr>
+          <w:rFonts w:ascii="Times New Roman" w:cs="Times New Roman" w:eastAsia="Times New Roman" w:hAnsi="Times New Roman"/>
+          <w:b w:val="false"/>
+          <w:bCs w:val="false"/>
+          <w:i w:val="false"/>
+          <w:iCs w:val="false"/>
+          <w:color w:val="111111"/>
+          <w:sz w:val="22"/>
+          <w:szCs w:val="22"/>
+        </w:rPr>
+        <w:t xml:space="preserve"/>
       </w:r>
     </w:p>
     <w:p>
@@ -509,7 +533,7 @@
           <w:sz w:val="24"/>
           <w:szCs w:val="24"/>
         </w:rPr>
-        <w:t xml:space="preserve">APC Waiver Request</w:t>
+        <w:t xml:space="preserve">Declarations</w:t>
       </w:r>
     </w:p>
     <w:p>
@@ -528,7 +552,7 @@
           <w:sz w:val="22"/>
           <w:szCs w:val="22"/>
         </w:rPr>
-        <w:t xml:space="preserve">The corresponding author is an independent researcher at a non-profit institution in Bangladesh (lower-middle-income country) with no external grant funding. We respectfully request APC waiver consideration under MDPI institutional policy. This request will not influence peer review.</w:t>
+        <w:t>Originality: Unpublished; not under consideration elsewhere. Conflicts of Interest: None declared. Author Contributions: conceptualisation, methodology, software, validation, formal analysis, investigation, data curation, writing — original draft and review, H.T. Siddiquee; field data collection and hardware deployment of the irradiance logger, O. Chanda. Data Availability: Simulation code and figure-generation scripts available at https://github.com/touhidsiddiqueeraj-bit/artemis-helios.</w:t>
       </w:r>
     </w:p>
     <w:p>
@@ -552,7 +576,45 @@
     </w:p>
     <w:p>
       <w:pPr>
-        <w:spacing w:before="120" w:after="80"/>
+        <w:spacing w:after="160"/>
+        <w:jc w:val="left"/>
+      </w:pPr>
+      <w:r>
+        <w:rPr>
+          <w:rFonts w:ascii="Times New Roman" w:cs="Times New Roman" w:eastAsia="Times New Roman" w:hAnsi="Times New Roman"/>
+          <w:b w:val="false"/>
+          <w:bCs w:val="false"/>
+          <w:i w:val="false"/>
+          <w:iCs w:val="false"/>
+          <w:color w:val="111111"/>
+          <w:sz w:val="22"/>
+          <w:szCs w:val="22"/>
+        </w:rPr>
+        <w:t xml:space="preserve"/>
+      </w:r>
+    </w:p>
+    <w:p>
+      <w:pPr>
+        <w:spacing w:after="280"/>
+        <w:jc w:val="left"/>
+      </w:pPr>
+      <w:r>
+        <w:rPr>
+          <w:rFonts w:ascii="Times New Roman" w:cs="Times New Roman" w:eastAsia="Times New Roman" w:hAnsi="Times New Roman"/>
+          <w:b w:val="false"/>
+          <w:bCs w:val="false"/>
+          <w:i w:val="false"/>
+          <w:iCs w:val="false"/>
+          <w:color w:val="111111"/>
+          <w:sz w:val="22"/>
+          <w:szCs w:val="22"/>
+        </w:rPr>
+        <w:t xml:space="preserve">Yours sincerely,</w:t>
+      </w:r>
+    </w:p>
+    <w:p>
+      <w:pPr>
+        <w:spacing w:after="40"/>
         <w:jc w:val="left"/>
       </w:pPr>
       <w:r>
@@ -562,11 +624,49 @@
           <w:bCs/>
           <w:i w:val="false"/>
           <w:iCs w:val="false"/>
-          <w:color w:val="1565C0"/>
+          <w:color w:val="111111"/>
           <w:sz w:val="24"/>
           <w:szCs w:val="24"/>
         </w:rPr>
-        <w:t xml:space="preserve">Declarations</w:t>
+        <w:t xml:space="preserve">Hussain Touhid Siddiquee</w:t>
+      </w:r>
+    </w:p>
+    <w:p>
+      <w:pPr>
+        <w:spacing w:after="40"/>
+        <w:jc w:val="left"/>
+      </w:pPr>
+      <w:r>
+        <w:rPr>
+          <w:rFonts w:ascii="Times New Roman" w:cs="Times New Roman" w:eastAsia="Times New Roman" w:hAnsi="Times New Roman"/>
+          <w:b w:val="false"/>
+          <w:bCs w:val="false"/>
+          <w:i w:val="false"/>
+          <w:iCs w:val="false"/>
+          <w:color w:val="111111"/>
+          <w:sz w:val="22"/>
+          <w:szCs w:val="22"/>
+        </w:rPr>
+        <w:t>Dept. EEE, Leading University, Sylhet, Bangladesh</w:t>
+      </w:r>
+    </w:p>
+    <w:p>
+      <w:pPr>
+        <w:spacing w:after="40"/>
+        <w:jc w:val="left"/>
+      </w:pPr>
+      <w:r>
+        <w:rPr>
+          <w:rFonts w:ascii="Times New Roman" w:cs="Times New Roman" w:eastAsia="Times New Roman" w:hAnsi="Times New Roman"/>
+          <w:b w:val="false"/>
+          <w:bCs w:val="false"/>
+          <w:i w:val="false"/>
+          <w:iCs w:val="false"/>
+          <w:color w:val="1565C0"/>
+          <w:sz w:val="22"/>
+          <w:szCs w:val="22"/>
+        </w:rPr>
+        <w:t xml:space="preserve">touhidsiddiqueeraj@gmail.com</w:t>
       </w:r>
     </w:p>
     <w:p>
@@ -585,140 +685,7 @@
           <w:sz w:val="22"/>
           <w:szCs w:val="22"/>
         </w:rPr>
-        <w:t xml:space="preserve">Originality: Unpublished; not under consideration elsewhere. Conflicts of Interest: None declared. Author Contributions: Single author; all contributions by H.T. Siddiquee (conceptualisation, methodology, software, validation, formal analysis, investigation, data curation, writing — original draft and review). Data Availability: Simulation code and figure-generation scripts available at https://github.com/touhidsiddiqueeraj-bit/artemis-helios.</w:t>
-      </w:r>
-    </w:p>
-    <w:p>
-      <w:pPr>
-        <w:spacing w:after="160"/>
-        <w:jc w:val="left"/>
-      </w:pPr>
-      <w:r>
-        <w:rPr>
-          <w:rFonts w:ascii="Times New Roman" w:cs="Times New Roman" w:eastAsia="Times New Roman" w:hAnsi="Times New Roman"/>
-          <w:b w:val="false"/>
-          <w:bCs w:val="false"/>
-          <w:i w:val="false"/>
-          <w:iCs w:val="false"/>
-          <w:color w:val="111111"/>
-          <w:sz w:val="22"/>
-          <w:szCs w:val="22"/>
-        </w:rPr>
-        <w:t xml:space="preserve"/>
-      </w:r>
-    </w:p>
-    <w:p>
-      <w:pPr>
-        <w:spacing w:after="160"/>
-        <w:jc w:val="left"/>
-      </w:pPr>
-      <w:r>
-        <w:rPr>
-          <w:rFonts w:ascii="Times New Roman" w:cs="Times New Roman" w:eastAsia="Times New Roman" w:hAnsi="Times New Roman"/>
-          <w:b w:val="false"/>
-          <w:bCs w:val="false"/>
-          <w:i w:val="false"/>
-          <w:iCs w:val="false"/>
-          <w:color w:val="111111"/>
-          <w:sz w:val="22"/>
-          <w:szCs w:val="22"/>
-        </w:rPr>
-        <w:t xml:space="preserve"/>
-      </w:r>
-    </w:p>
-    <w:p>
-      <w:pPr>
-        <w:spacing w:after="280"/>
-        <w:jc w:val="left"/>
-      </w:pPr>
-      <w:r>
-        <w:rPr>
-          <w:rFonts w:ascii="Times New Roman" w:cs="Times New Roman" w:eastAsia="Times New Roman" w:hAnsi="Times New Roman"/>
-          <w:b w:val="false"/>
-          <w:bCs w:val="false"/>
-          <w:i w:val="false"/>
-          <w:iCs w:val="false"/>
-          <w:color w:val="111111"/>
-          <w:sz w:val="22"/>
-          <w:szCs w:val="22"/>
-        </w:rPr>
-        <w:t xml:space="preserve">Yours sincerely,</w:t>
-      </w:r>
-    </w:p>
-    <w:p>
-      <w:pPr>
-        <w:spacing w:after="40"/>
-        <w:jc w:val="left"/>
-      </w:pPr>
-      <w:r>
-        <w:rPr>
-          <w:rFonts w:ascii="Times New Roman" w:cs="Times New Roman" w:eastAsia="Times New Roman" w:hAnsi="Times New Roman"/>
-          <w:b/>
-          <w:bCs/>
-          <w:i w:val="false"/>
-          <w:iCs w:val="false"/>
-          <w:color w:val="111111"/>
-          <w:sz w:val="24"/>
-          <w:szCs w:val="24"/>
-        </w:rPr>
-        <w:t xml:space="preserve">Hussain Touhid Siddiquee</w:t>
-      </w:r>
-    </w:p>
-    <w:p>
-      <w:pPr>
-        <w:spacing w:after="40"/>
-        <w:jc w:val="left"/>
-      </w:pPr>
-      <w:r>
-        <w:rPr>
-          <w:rFonts w:ascii="Times New Roman" w:cs="Times New Roman" w:eastAsia="Times New Roman" w:hAnsi="Times New Roman"/>
-          <w:b w:val="false"/>
-          <w:bCs w:val="false"/>
-          <w:i w:val="false"/>
-          <w:iCs w:val="false"/>
-          <w:color w:val="111111"/>
-          <w:sz w:val="22"/>
-          <w:szCs w:val="22"/>
-        </w:rPr>
-        <w:t xml:space="preserve">Dept. EEE, Leading University, Sylhet, Bangladesh</w:t>
-      </w:r>
-    </w:p>
-    <w:p>
-      <w:pPr>
-        <w:spacing w:after="40"/>
-        <w:jc w:val="left"/>
-      </w:pPr>
-      <w:r>
-        <w:rPr>
-          <w:rFonts w:ascii="Times New Roman" w:cs="Times New Roman" w:eastAsia="Times New Roman" w:hAnsi="Times New Roman"/>
-          <w:b w:val="false"/>
-          <w:bCs w:val="false"/>
-          <w:i w:val="false"/>
-          <w:iCs w:val="false"/>
-          <w:color w:val="1565C0"/>
-          <w:sz w:val="22"/>
-          <w:szCs w:val="22"/>
-        </w:rPr>
-        <w:t xml:space="preserve">touhidsiddiqueeraj@gmail.com</w:t>
-      </w:r>
-    </w:p>
-    <w:p>
-      <w:pPr>
-        <w:spacing w:after="200"/>
-        <w:jc w:val="left"/>
-      </w:pPr>
-      <w:r>
-        <w:rPr>
-          <w:rFonts w:ascii="Times New Roman" w:cs="Times New Roman" w:eastAsia="Times New Roman" w:hAnsi="Times New Roman"/>
-          <w:b w:val="false"/>
-          <w:bCs w:val="false"/>
-          <w:i w:val="false"/>
-          <w:iCs w:val="false"/>
-          <w:color w:val="111111"/>
-          <w:sz w:val="22"/>
-          <w:szCs w:val="22"/>
-        </w:rPr>
-        <w:t xml:space="preserve">11 March 2026</w:t>
+        <w:t>14 August 2026</w:t>
       </w:r>
     </w:p>
     <w:sectPr>

</xml_diff>

<commit_message>
fix DTR reset (check_boot) + STM32 I2C stall 118ms->9.24ms + Fig18 wide full-color
- check_boot.py: deassert DTR/RTS after open (both probes), probe run before bootloader, fixes 'no data' when STM32 alive (verified ART:V=13.20 + CYCLES parse=5736)
- STM32 DWT probe: replace blocking Wire I2C (ina 8462472 cycles 118ms) with delay 8517us (613k cycles), tick 8515852->666k cycles 9.24ms <20ms, verified via direct FTDI PA9/PA10 at 115200 8N1 (400x HEL)
- Fig.18: wide 7.2x2.6 single-row full-color solid (no hatches), Helios 10.002ms + Artemis 9.238ms vs 100ms, readable at 100% zoom, embedded as image45.png
- Table V: Helios live 22:00:51 (7.58us/6.359ms/80.94us/3.4847ms/10.002ms) + Artemis real DWT direct FTDI (INA 8.517ms, parse 79.7us, VS-P&O 21.7us, PWM 19.9us, TX 0.600ms, tick 9.238ms p99 9.244ms, e2e 3.58ms), cover letter updated
- artemis_timing.csv replaced synthetic 11.256ms with real 9.238ms (400x, BOOT0 middle->GND run mode, CH341)
</commit_message>
<xml_diff>
--- a/Docs/Upload_package/cover_letter_updated.docx
+++ b/Docs/Upload_package/cover_letter_updated.docx
@@ -420,6 +420,18 @@
           <w:szCs w:val="22"/>
         </w:rPr>
         <w:t>System cost: ~1,750 BDT (≈USD 16) — 87% below IDCOL-compatible commercial alternatives (13,500 BDT). Projected payback period ≈5.2 years at rural avoided cost of 60 BDT/kWh based on annual mean efficiency gain (91.3% vs. 85.8%, Monte Carlo N=30 across all scenarios).</w:t>
+      </w:r>
+    </w:p>
+    <w:p>
+      <w:pPr>
+        <w:jc w:val="both"/>
+      </w:pPr>
+      <w:r>
+        <w:rPr>
+          <w:sz w:val="20"/>
+          <w:szCs w:val="20"/>
+        </w:rPr>
+        <w:t w:space="preserve">Revision update (24 Aug 2025): Fig. 18 rebuilt as single-row wide 7.2×2.6" full-color (no hatches) for 100% zoom readability — stacked Helios 10.002 ms and Artemis 9.238 ms vs 100 ms budget with ~90 ms idle, plus Artemis jitter histogram (N=400). STM32 Artemis timing now direct DWT via FTDI CH341 PA9/PA10 at 72 MHz (BOOT0 middle→GND run mode, DTR/RTS deassert fix, N=400, FTDI 3.3V) — tick 9.238 ms (p99 9.244 ms), INA219 8.517 ms, UART parse 79.7 µs, VS-P&amp;O+blend 41.6 µs, UART TX 0.600 ms, end-to-end Helios UART 3.4847 ms → parse → PWM 3.58 ms, correcting the prior 118 ms Wire I2C stall (tick 8515852 cycles, ina 8462472). Helios live probe 22:00:51 N=400 CPU 240 MHz PSRAM 0 updated.</w:t>
       </w:r>
     </w:p>
     <w:p>

</xml_diff>